<commit_message>
Describe the solution branch's spec-first commit history
</commit_message>
<xml_diff>
--- a/docs/spec-driven-development.docx
+++ b/docs/spec-driven-development.docx
@@ -1918,7 +1918,7 @@
                 <w:sz w:val="19"/>
                 <w:szCs w:val="19"/>
               </w:rPr>
-              <w:t xml:space="preserve">A reference solution: a filled-in</w:t>
+              <w:t xml:space="preserve">A reference solution, committed spec first: a first-draft</w:t>
             </w:r>
             <w:r>
               <w:rPr>
@@ -1940,7 +1940,7 @@
                 <w:sz w:val="19"/>
                 <w:szCs w:val="19"/>
               </w:rPr>
-              <w:t xml:space="preserve">,</w:t>
+              <w:t xml:space="preserve">, three</w:t>
             </w:r>
             <w:r>
               <w:rPr>
@@ -1955,6 +1955,35 @@
                 <w:sz w:val="19"/>
                 <w:szCs w:val="19"/>
               </w:rPr>
+              <w:t xml:space="preserve">Spec: ...</w:t>
+            </w:r>
+            <w:r>
+              <w:rPr>
+                <w:sz w:val="19"/>
+                <w:szCs w:val="19"/>
+              </w:rPr>
+              <w:t xml:space="preserve"> </w:t>
+            </w:r>
+            <w:r>
+              <w:rPr>
+                <w:sz w:val="19"/>
+                <w:szCs w:val="19"/>
+              </w:rPr>
+              <w:t xml:space="preserve">commits that patch the gaps implementation exposed, then</w:t>
+            </w:r>
+            <w:r>
+              <w:rPr>
+                <w:sz w:val="19"/>
+                <w:szCs w:val="19"/>
+              </w:rPr>
+              <w:t xml:space="preserve"> </w:t>
+            </w:r>
+            <w:r>
+              <w:rPr>
+                <w:rStyle w:val="VerbatimChar"/>
+                <w:sz w:val="19"/>
+                <w:szCs w:val="19"/>
+              </w:rPr>
               <w:t xml:space="preserve">src/minitrain/early_stopping.py</w:t>
             </w:r>
             <w:r>
@@ -1991,7 +2020,7 @@
                 <w:sz w:val="19"/>
                 <w:szCs w:val="19"/>
               </w:rPr>
-              <w:t xml:space="preserve">and the CLI, tests for every acceptance criterion, and a completed worksheet. Compare with it after you finish.</w:t>
+              <w:t xml:space="preserve">and the CLI, a test for every acceptance criterion, and a completed worksheet. Compare with it after you finish.</w:t>
             </w:r>
           </w:p>
         </w:tc>
@@ -2012,6 +2041,33 @@
           <w:rStyle w:val="NormalTok"/>
         </w:rPr>
         <w:t xml:space="preserve"> fetch origin</w:t>
+      </w:r>
+      <w:r>
+        <w:br/>
+      </w:r>
+      <w:r>
+        <w:rPr>
+          <w:rStyle w:val="FunctionTok"/>
+        </w:rPr>
+        <w:t xml:space="preserve">git</w:t>
+      </w:r>
+      <w:r>
+        <w:rPr>
+          <w:rStyle w:val="NormalTok"/>
+        </w:rPr>
+        <w:t xml:space="preserve"> log </w:t>
+      </w:r>
+      <w:r>
+        <w:rPr>
+          <w:rStyle w:val="AttributeTok"/>
+        </w:rPr>
+        <w:t xml:space="preserve">--oneline</w:t>
+      </w:r>
+      <w:r>
+        <w:rPr>
+          <w:rStyle w:val="NormalTok"/>
+        </w:rPr>
+        <w:t xml:space="preserve"> main..origin/solution/early-stopping</w:t>
       </w:r>
       <w:r>
         <w:br/>

</xml_diff>